<commit_message>
Deploy U3/U4 full exams: 4-page U4 pack and answer PDF.
Adds printable u04-full + answers, larger tianzige tooling, and wires print-index for GitHub Pages.

Co-authored-by: Cursor <cursoragent@cursor.com>
</commit_message>
<xml_diff>
--- a/printables/full-answers/u03-full-answers.docx
+++ b/printables/full-answers/u03-full-answers.docx
@@ -29,7 +29,7 @@
           <w:color w:val="E85D04"/>
           <w:sz w:val="26"/>
         </w:rPr>
-        <w:t>第三单元完整摸底卷 · 参考答案（第1–2页）</w:t>
+        <w:t>第三单元完整摸底卷 · 参考答案</w:t>
       </w:r>
     </w:p>
     <w:p>
@@ -128,7 +128,7 @@
           <w:color w:val="1C1917"/>
           <w:sz w:val="19"/>
         </w:rPr>
-        <w:t>1.（1）③痕际→痕迹　（2）②平担→平坦　（3）②触脚→触角　2.②（缘＝因为）</w:t>
+        <w:t>1.（1）③痕际→痕迹　（2）②平担→平坦　（3）②触脚→触角　2.②（缘＝因为；①可怜≠可惜；③逊≠谦逊）</w:t>
       </w:r>
     </w:p>
     <w:p>
@@ -184,7 +184,7 @@
           <w:color w:val="E85D04"/>
           <w:sz w:val="20"/>
         </w:rPr>
-        <w:t>五、阅读（米虫）</w:t>
+        <w:t>五、阅读（一）米虫</w:t>
       </w:r>
     </w:p>
     <w:p>
@@ -198,7 +198,7 @@
           <w:color w:val="1C1917"/>
           <w:sz w:val="19"/>
         </w:rPr>
-        <w:t>潜伏：隐藏、埋伏；文中指米虫藏在米里。</w:t>
+        <w:t>1.潜伏：隐藏、埋伏；文中指米虫藏在米里。</w:t>
       </w:r>
     </w:p>
     <w:p>
@@ -212,7 +212,105 @@
           <w:color w:val="1C1917"/>
           <w:sz w:val="19"/>
         </w:rPr>
-        <w:t>（第3–4页待补）</w:t>
+        <w:t>2.表：倾斜后—转圈走/像走台步，发现可写「样子像模特、很美」；侧翻—发现可写「生存能力强/很聪明」</w:t>
+      </w:r>
+    </w:p>
+    <w:p>
+      <w:pPr>
+        <w:spacing w:before="0" w:after="20" w:line="252" w:lineRule="auto"/>
+      </w:pPr>
+      <w:r>
+        <w:rPr>
+          <w:rFonts w:ascii="宋体" w:hAnsi="宋体" w:eastAsia="宋体"/>
+          <w:b w:val="0"/>
+          <w:color w:val="1C1917"/>
+          <w:sz w:val="19"/>
+        </w:rPr>
+        <w:t>3.开放题：写清观察对象与发现即可</w:t>
+      </w:r>
+    </w:p>
+    <w:p>
+      <w:pPr>
+        <w:spacing w:before="80" w:after="20" w:line="252" w:lineRule="auto"/>
+      </w:pPr>
+      <w:r>
+        <w:rPr>
+          <w:rFonts w:ascii="宋体" w:hAnsi="宋体" w:eastAsia="宋体"/>
+          <w:b/>
+          <w:color w:val="E85D04"/>
+          <w:sz w:val="20"/>
+        </w:rPr>
+        <w:t>五、阅读（二）它们的聪明与愚笨</w:t>
+      </w:r>
+    </w:p>
+    <w:p>
+      <w:pPr>
+        <w:spacing w:before="0" w:after="20" w:line="252" w:lineRule="auto"/>
+      </w:pPr>
+      <w:r>
+        <w:rPr>
+          <w:rFonts w:ascii="宋体" w:hAnsi="宋体" w:eastAsia="宋体"/>
+          <w:b w:val="0"/>
+          <w:color w:val="1C1917"/>
+          <w:sz w:val="19"/>
+        </w:rPr>
+        <w:t>1.（1）×（居民们＝黄蜂）　（2）×（直接倒会被土壤吸收到不了蜂巢，不是「立刻激怒」）　（3）√</w:t>
+      </w:r>
+    </w:p>
+    <w:p>
+      <w:pPr>
+        <w:spacing w:before="0" w:after="20" w:line="252" w:lineRule="auto"/>
+      </w:pPr>
+      <w:r>
+        <w:rPr>
+          <w:rFonts w:ascii="宋体" w:hAnsi="宋体" w:eastAsia="宋体"/>
+          <w:b w:val="0"/>
+          <w:color w:val="1C1917"/>
+          <w:sz w:val="19"/>
+        </w:rPr>
+        <w:t>2.画：决定等到夜幕降临时再回来。到那时，巢穴里的居民们都会从田野回到家中。</w:t>
+      </w:r>
+    </w:p>
+    <w:p>
+      <w:pPr>
+        <w:spacing w:before="0" w:after="20" w:line="252" w:lineRule="auto"/>
+      </w:pPr>
+      <w:r>
+        <w:rPr>
+          <w:rFonts w:ascii="宋体" w:hAnsi="宋体" w:eastAsia="宋体"/>
+          <w:b w:val="0"/>
+          <w:color w:val="1C1917"/>
+          <w:sz w:val="19"/>
+        </w:rPr>
+        <w:t>3.示例：边捉黄蜂边聊天、提问学习，虽有风险却很愉快（意思对即可）</w:t>
+      </w:r>
+    </w:p>
+    <w:p>
+      <w:pPr>
+        <w:spacing w:before="80" w:after="20" w:line="252" w:lineRule="auto"/>
+      </w:pPr>
+      <w:r>
+        <w:rPr>
+          <w:rFonts w:ascii="宋体" w:hAnsi="宋体" w:eastAsia="宋体"/>
+          <w:b/>
+          <w:color w:val="E85D04"/>
+          <w:sz w:val="20"/>
+        </w:rPr>
+        <w:t>六、习作</w:t>
+      </w:r>
+    </w:p>
+    <w:p>
+      <w:pPr>
+        <w:spacing w:before="0" w:after="20" w:line="252" w:lineRule="auto"/>
+      </w:pPr>
+      <w:r>
+        <w:rPr>
+          <w:rFonts w:ascii="宋体" w:hAnsi="宋体" w:eastAsia="宋体"/>
+          <w:b w:val="0"/>
+          <w:color w:val="1C1917"/>
+          <w:sz w:val="19"/>
+        </w:rPr>
+        <w:t>略（日记形式，题目自拟，写出观察收获与真实感受）</w:t>
       </w:r>
     </w:p>
     <w:p>

</xml_diff>